<commit_message>
Abentauer 10 Update, Camille Buch update
</commit_message>
<xml_diff>
--- a/docs/Buch Camille Chronicles/Character-Bios.docx
+++ b/docs/Buch Camille Chronicles/Character-Bios.docx
@@ -132,14 +132,12 @@
           <w:lang w:val="en-US"/>
         </w:rPr>
       </w:pPr>
-      <w:proofErr w:type="spellStart"/>
       <w:r>
         <w:rPr>
           <w:lang w:val="en-US"/>
         </w:rPr>
         <w:t>Bodyform</w:t>
       </w:r>
-      <w:proofErr w:type="spellEnd"/>
       <w:r>
         <w:rPr>
           <w:lang w:val="en-US"/>
@@ -392,19 +390,11 @@
           <w:lang w:val="en-US"/>
         </w:rPr>
       </w:pPr>
-      <w:proofErr w:type="spellStart"/>
-      <w:r>
-        <w:rPr>
-          <w:lang w:val="en-US"/>
-        </w:rPr>
-        <w:t>Bodyform</w:t>
-      </w:r>
-      <w:proofErr w:type="spellEnd"/>
-      <w:r>
-        <w:rPr>
-          <w:lang w:val="en-US"/>
-        </w:rPr>
-        <w:t>:</w:t>
+      <w:r>
+        <w:rPr>
+          <w:lang w:val="en-US"/>
+        </w:rPr>
+        <w:t>Bodyform:</w:t>
       </w:r>
       <w:r>
         <w:rPr>
@@ -469,14 +459,12 @@
         </w:rPr>
         <w:t xml:space="preserve"> </w:t>
       </w:r>
-      <w:proofErr w:type="spellStart"/>
       <w:r>
         <w:rPr>
           <w:lang w:val="en-US"/>
         </w:rPr>
         <w:t>Rintreahr</w:t>
       </w:r>
-      <w:proofErr w:type="spellEnd"/>
     </w:p>
     <w:p>
       <w:pPr>
@@ -526,16 +514,8 @@
         <w:rPr>
           <w:lang w:val="en-US"/>
         </w:rPr>
-        <w:t xml:space="preserve"> </w:t>
-      </w:r>
-      <w:proofErr w:type="spellStart"/>
-      <w:r>
-        <w:rPr>
-          <w:lang w:val="en-US"/>
-        </w:rPr>
-        <w:t>Bodymagic</w:t>
-      </w:r>
-      <w:proofErr w:type="spellEnd"/>
+        <w:t xml:space="preserve"> Bodymagic</w:t>
+      </w:r>
     </w:p>
     <w:p>
       <w:pPr>
@@ -649,28 +629,12 @@
           </mc:Fallback>
         </mc:AlternateContent>
       </w:r>
-      <w:proofErr w:type="spellStart"/>
-      <w:r>
-        <w:rPr>
-          <w:lang w:val="en-US"/>
-        </w:rPr>
-        <w:t>Herriar</w:t>
-      </w:r>
-      <w:proofErr w:type="spellEnd"/>
-      <w:r>
-        <w:rPr>
-          <w:lang w:val="en-US"/>
-        </w:rPr>
-        <w:t xml:space="preserve"> </w:t>
-      </w:r>
-      <w:proofErr w:type="spellStart"/>
-      <w:r>
-        <w:rPr>
-          <w:lang w:val="en-US"/>
-        </w:rPr>
-        <w:t>Ormarill</w:t>
-      </w:r>
-      <w:proofErr w:type="spellEnd"/>
+      <w:r>
+        <w:rPr>
+          <w:lang w:val="en-US"/>
+        </w:rPr>
+        <w:t>Herriar Ormarill</w:t>
+      </w:r>
     </w:p>
     <w:p>
       <w:pPr>
@@ -691,19 +655,11 @@
           <w:lang w:val="en-US"/>
         </w:rPr>
       </w:pPr>
-      <w:proofErr w:type="spellStart"/>
-      <w:r>
-        <w:rPr>
-          <w:lang w:val="en-US"/>
-        </w:rPr>
-        <w:t>Bodyform</w:t>
-      </w:r>
-      <w:proofErr w:type="spellEnd"/>
-      <w:r>
-        <w:rPr>
-          <w:lang w:val="en-US"/>
-        </w:rPr>
-        <w:t>:</w:t>
+      <w:r>
+        <w:rPr>
+          <w:lang w:val="en-US"/>
+        </w:rPr>
+        <w:t>Bodyform:</w:t>
       </w:r>
       <w:r>
         <w:rPr>
@@ -786,16 +742,8 @@
         <w:rPr>
           <w:lang w:val="en-US"/>
         </w:rPr>
-        <w:t xml:space="preserve"> </w:t>
-      </w:r>
-      <w:proofErr w:type="spellStart"/>
-      <w:r>
-        <w:rPr>
-          <w:lang w:val="en-US"/>
-        </w:rPr>
-        <w:t>Bodymagic</w:t>
-      </w:r>
-      <w:proofErr w:type="spellEnd"/>
+        <w:t xml:space="preserve"> Bodymagic</w:t>
+      </w:r>
     </w:p>
     <w:p>
       <w:pPr>
@@ -827,22 +775,440 @@
         <w:rPr>
           <w:lang w:val="en-US"/>
         </w:rPr>
-        <w:t xml:space="preserve"> The Soul that is bound to Camille, tells that he had died of old age so Camille could acquire </w:t>
-      </w:r>
-      <w:proofErr w:type="spellStart"/>
-      <w:r>
-        <w:rPr>
-          <w:lang w:val="en-US"/>
-        </w:rPr>
-        <w:t>Bodymagic</w:t>
-      </w:r>
-      <w:proofErr w:type="spellEnd"/>
-      <w:r>
-        <w:rPr>
-          <w:lang w:val="en-US"/>
-        </w:rPr>
-        <w:t xml:space="preserve"> (instead he had a heart attack while having sex with a prostitute)</w:t>
-      </w:r>
+        <w:t xml:space="preserve"> The Soul that is bound to Camille, tells that he had died of old age so Camille could acquire Bodymagic (instead he had a heart attack while having sex with a prostitute)</w:t>
+      </w:r>
+    </w:p>
+    <w:p>
+      <w:pPr>
+        <w:pStyle w:val="berschrift2"/>
+        <w:ind w:left="708" w:hanging="708"/>
+        <w:rPr>
+          <w:lang w:val="en-US"/>
+        </w:rPr>
+      </w:pPr>
+      <w:r>
+        <w:rPr>
+          <w:noProof/>
+        </w:rPr>
+        <mc:AlternateContent>
+          <mc:Choice Requires="wps">
+            <w:drawing>
+              <wp:anchor distT="0" distB="0" distL="114300" distR="114300" simplePos="0" relativeHeight="251700224" behindDoc="0" locked="0" layoutInCell="1" allowOverlap="1" wp14:anchorId="3AC3EAFE" wp14:editId="091AED2B">
+                <wp:simplePos x="0" y="0"/>
+                <wp:positionH relativeFrom="column">
+                  <wp:posOffset>0</wp:posOffset>
+                </wp:positionH>
+                <wp:positionV relativeFrom="paragraph">
+                  <wp:posOffset>386715</wp:posOffset>
+                </wp:positionV>
+                <wp:extent cx="2063750" cy="2679700"/>
+                <wp:effectExtent l="0" t="0" r="12700" b="25400"/>
+                <wp:wrapSquare wrapText="bothSides"/>
+                <wp:docPr id="1744019556" name="Rechteck 2"/>
+                <wp:cNvGraphicFramePr/>
+                <a:graphic xmlns:a="http://schemas.openxmlformats.org/drawingml/2006/main">
+                  <a:graphicData uri="http://schemas.microsoft.com/office/word/2010/wordprocessingShape">
+                    <wps:wsp>
+                      <wps:cNvSpPr/>
+                      <wps:spPr>
+                        <a:xfrm>
+                          <a:off x="0" y="0"/>
+                          <a:ext cx="2063750" cy="2679700"/>
+                        </a:xfrm>
+                        <a:prstGeom prst="rect">
+                          <a:avLst/>
+                        </a:prstGeom>
+                      </wps:spPr>
+                      <wps:style>
+                        <a:lnRef idx="2">
+                          <a:schemeClr val="accent1">
+                            <a:shade val="15000"/>
+                          </a:schemeClr>
+                        </a:lnRef>
+                        <a:fillRef idx="1">
+                          <a:schemeClr val="accent1"/>
+                        </a:fillRef>
+                        <a:effectRef idx="0">
+                          <a:schemeClr val="accent1"/>
+                        </a:effectRef>
+                        <a:fontRef idx="minor">
+                          <a:schemeClr val="lt1"/>
+                        </a:fontRef>
+                      </wps:style>
+                      <wps:bodyPr rot="0" spcFirstLastPara="0" vertOverflow="overflow" horzOverflow="overflow" vert="horz" wrap="square" lIns="91440" tIns="45720" rIns="91440" bIns="45720" numCol="1" spcCol="0" rtlCol="0" fromWordArt="0" anchor="ctr" anchorCtr="0" forceAA="0" compatLnSpc="1">
+                        <a:prstTxWarp prst="textNoShape">
+                          <a:avLst/>
+                        </a:prstTxWarp>
+                        <a:noAutofit/>
+                      </wps:bodyPr>
+                    </wps:wsp>
+                  </a:graphicData>
+                </a:graphic>
+                <wp14:sizeRelH relativeFrom="margin">
+                  <wp14:pctWidth>0</wp14:pctWidth>
+                </wp14:sizeRelH>
+                <wp14:sizeRelV relativeFrom="margin">
+                  <wp14:pctHeight>0</wp14:pctHeight>
+                </wp14:sizeRelV>
+              </wp:anchor>
+            </w:drawing>
+          </mc:Choice>
+          <mc:Fallback>
+            <w:pict>
+              <v:rect w14:anchorId="56349E76" id="Rechteck 2" o:spid="_x0000_s1026" style="position:absolute;margin-left:0;margin-top:30.45pt;width:162.5pt;height:211pt;z-index:251700224;visibility:visible;mso-wrap-style:square;mso-width-percent:0;mso-height-percent:0;mso-wrap-distance-left:9pt;mso-wrap-distance-top:0;mso-wrap-distance-right:9pt;mso-wrap-distance-bottom:0;mso-position-horizontal:absolute;mso-position-horizontal-relative:text;mso-position-vertical:absolute;mso-position-vertical-relative:text;mso-width-percent:0;mso-height-percent:0;mso-width-relative:margin;mso-height-relative:margin;v-text-anchor:middle" o:gfxdata="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" fillcolor="#4472c4 [3204]" strokecolor="#09101d [484]" strokeweight="1pt">
+                <w10:wrap type="square"/>
+              </v:rect>
+            </w:pict>
+          </mc:Fallback>
+        </mc:AlternateContent>
+      </w:r>
+      <w:r>
+        <w:rPr>
+          <w:lang w:val="en-US"/>
+        </w:rPr>
+        <w:t>Camille Mother</w:t>
+      </w:r>
+    </w:p>
+    <w:p>
+      <w:pPr>
+        <w:rPr>
+          <w:lang w:val="en-US"/>
+        </w:rPr>
+      </w:pPr>
+      <w:r>
+        <w:rPr>
+          <w:lang w:val="en-US"/>
+        </w:rPr>
+        <w:t>Age/Birthday:</w:t>
+      </w:r>
+    </w:p>
+    <w:p>
+      <w:pPr>
+        <w:rPr>
+          <w:lang w:val="en-US"/>
+        </w:rPr>
+      </w:pPr>
+      <w:r>
+        <w:rPr>
+          <w:lang w:val="en-US"/>
+        </w:rPr>
+        <w:t>Bodyform:</w:t>
+      </w:r>
+    </w:p>
+    <w:p>
+      <w:pPr>
+        <w:rPr>
+          <w:lang w:val="en-US"/>
+        </w:rPr>
+      </w:pPr>
+      <w:r>
+        <w:rPr>
+          <w:lang w:val="en-US"/>
+        </w:rPr>
+        <w:t>Heritage:</w:t>
+      </w:r>
+    </w:p>
+    <w:p>
+      <w:pPr>
+        <w:rPr>
+          <w:lang w:val="en-US"/>
+        </w:rPr>
+      </w:pPr>
+      <w:r>
+        <w:rPr>
+          <w:lang w:val="en-US"/>
+        </w:rPr>
+        <w:t>Domicile:</w:t>
+      </w:r>
+    </w:p>
+    <w:p>
+      <w:pPr>
+        <w:rPr>
+          <w:lang w:val="en-US"/>
+        </w:rPr>
+      </w:pPr>
+      <w:r>
+        <w:rPr>
+          <w:lang w:val="en-US"/>
+        </w:rPr>
+        <w:t>Clothing:</w:t>
+      </w:r>
+    </w:p>
+    <w:p>
+      <w:pPr>
+        <w:rPr>
+          <w:lang w:val="en-US"/>
+        </w:rPr>
+      </w:pPr>
+      <w:r>
+        <w:rPr>
+          <w:lang w:val="en-US"/>
+        </w:rPr>
+        <w:t>Affiliation:</w:t>
+      </w:r>
+    </w:p>
+    <w:p>
+      <w:pPr>
+        <w:rPr>
+          <w:lang w:val="en-US"/>
+        </w:rPr>
+      </w:pPr>
+      <w:r>
+        <w:rPr>
+          <w:lang w:val="en-US"/>
+        </w:rPr>
+        <w:t>Abilities:</w:t>
+      </w:r>
+      <w:r>
+        <w:rPr>
+          <w:lang w:val="en-US"/>
+        </w:rPr>
+        <w:t xml:space="preserve"> Mind Harmonist</w:t>
+      </w:r>
+    </w:p>
+    <w:p>
+      <w:pPr>
+        <w:rPr>
+          <w:lang w:val="en-US"/>
+        </w:rPr>
+      </w:pPr>
+      <w:r>
+        <w:rPr>
+          <w:lang w:val="en-US"/>
+        </w:rPr>
+        <w:t>Personality:</w:t>
+      </w:r>
+    </w:p>
+    <w:p>
+      <w:pPr>
+        <w:rPr>
+          <w:lang w:val="en-US"/>
+        </w:rPr>
+      </w:pPr>
+      <w:r>
+        <w:rPr>
+          <w:lang w:val="en-US"/>
+        </w:rPr>
+        <w:br/>
+        <w:t>Synopsis:</w:t>
+      </w:r>
+    </w:p>
+    <w:p>
+      <w:pPr>
+        <w:pStyle w:val="berschrift2"/>
+        <w:ind w:left="708" w:hanging="708"/>
+        <w:rPr>
+          <w:lang w:val="en-US"/>
+        </w:rPr>
+      </w:pPr>
+      <w:r>
+        <w:rPr>
+          <w:noProof/>
+        </w:rPr>
+        <w:lastRenderedPageBreak/>
+        <mc:AlternateContent>
+          <mc:Choice Requires="wps">
+            <w:drawing>
+              <wp:anchor distT="0" distB="0" distL="114300" distR="114300" simplePos="0" relativeHeight="251702272" behindDoc="0" locked="0" layoutInCell="1" allowOverlap="1" wp14:anchorId="501AAFAF" wp14:editId="2AD2A9B6">
+                <wp:simplePos x="0" y="0"/>
+                <wp:positionH relativeFrom="column">
+                  <wp:posOffset>0</wp:posOffset>
+                </wp:positionH>
+                <wp:positionV relativeFrom="paragraph">
+                  <wp:posOffset>386715</wp:posOffset>
+                </wp:positionV>
+                <wp:extent cx="2063750" cy="2679700"/>
+                <wp:effectExtent l="0" t="0" r="12700" b="25400"/>
+                <wp:wrapSquare wrapText="bothSides"/>
+                <wp:docPr id="1673652698" name="Rechteck 2"/>
+                <wp:cNvGraphicFramePr/>
+                <a:graphic xmlns:a="http://schemas.openxmlformats.org/drawingml/2006/main">
+                  <a:graphicData uri="http://schemas.microsoft.com/office/word/2010/wordprocessingShape">
+                    <wps:wsp>
+                      <wps:cNvSpPr/>
+                      <wps:spPr>
+                        <a:xfrm>
+                          <a:off x="0" y="0"/>
+                          <a:ext cx="2063750" cy="2679700"/>
+                        </a:xfrm>
+                        <a:prstGeom prst="rect">
+                          <a:avLst/>
+                        </a:prstGeom>
+                      </wps:spPr>
+                      <wps:style>
+                        <a:lnRef idx="2">
+                          <a:schemeClr val="accent1">
+                            <a:shade val="15000"/>
+                          </a:schemeClr>
+                        </a:lnRef>
+                        <a:fillRef idx="1">
+                          <a:schemeClr val="accent1"/>
+                        </a:fillRef>
+                        <a:effectRef idx="0">
+                          <a:schemeClr val="accent1"/>
+                        </a:effectRef>
+                        <a:fontRef idx="minor">
+                          <a:schemeClr val="lt1"/>
+                        </a:fontRef>
+                      </wps:style>
+                      <wps:bodyPr rot="0" spcFirstLastPara="0" vertOverflow="overflow" horzOverflow="overflow" vert="horz" wrap="square" lIns="91440" tIns="45720" rIns="91440" bIns="45720" numCol="1" spcCol="0" rtlCol="0" fromWordArt="0" anchor="ctr" anchorCtr="0" forceAA="0" compatLnSpc="1">
+                        <a:prstTxWarp prst="textNoShape">
+                          <a:avLst/>
+                        </a:prstTxWarp>
+                        <a:noAutofit/>
+                      </wps:bodyPr>
+                    </wps:wsp>
+                  </a:graphicData>
+                </a:graphic>
+                <wp14:sizeRelH relativeFrom="margin">
+                  <wp14:pctWidth>0</wp14:pctWidth>
+                </wp14:sizeRelH>
+                <wp14:sizeRelV relativeFrom="margin">
+                  <wp14:pctHeight>0</wp14:pctHeight>
+                </wp14:sizeRelV>
+              </wp:anchor>
+            </w:drawing>
+          </mc:Choice>
+          <mc:Fallback>
+            <w:pict>
+              <v:rect w14:anchorId="0C1F9BA0" id="Rechteck 2" o:spid="_x0000_s1026" style="position:absolute;margin-left:0;margin-top:30.45pt;width:162.5pt;height:211pt;z-index:251702272;visibility:visible;mso-wrap-style:square;mso-width-percent:0;mso-height-percent:0;mso-wrap-distance-left:9pt;mso-wrap-distance-top:0;mso-wrap-distance-right:9pt;mso-wrap-distance-bottom:0;mso-position-horizontal:absolute;mso-position-horizontal-relative:text;mso-position-vertical:absolute;mso-position-vertical-relative:text;mso-width-percent:0;mso-height-percent:0;mso-width-relative:margin;mso-height-relative:margin;v-text-anchor:middle" o:gfxdata="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" fillcolor="#4472c4 [3204]" strokecolor="#09101d [484]" strokeweight="1pt">
+                <w10:wrap type="square"/>
+              </v:rect>
+            </w:pict>
+          </mc:Fallback>
+        </mc:AlternateContent>
+      </w:r>
+      <w:r>
+        <w:rPr>
+          <w:lang w:val="en-US"/>
+        </w:rPr>
+        <w:t>Camilel Father</w:t>
+      </w:r>
+    </w:p>
+    <w:p>
+      <w:pPr>
+        <w:rPr>
+          <w:lang w:val="en-US"/>
+        </w:rPr>
+      </w:pPr>
+      <w:r>
+        <w:rPr>
+          <w:lang w:val="en-US"/>
+        </w:rPr>
+        <w:t>Age/Birthday:</w:t>
+      </w:r>
+    </w:p>
+    <w:p>
+      <w:pPr>
+        <w:rPr>
+          <w:lang w:val="en-US"/>
+        </w:rPr>
+      </w:pPr>
+      <w:r>
+        <w:rPr>
+          <w:lang w:val="en-US"/>
+        </w:rPr>
+        <w:t>Bodyform:</w:t>
+      </w:r>
+    </w:p>
+    <w:p>
+      <w:pPr>
+        <w:rPr>
+          <w:lang w:val="en-US"/>
+        </w:rPr>
+      </w:pPr>
+      <w:r>
+        <w:rPr>
+          <w:lang w:val="en-US"/>
+        </w:rPr>
+        <w:t>Heritage:</w:t>
+      </w:r>
+    </w:p>
+    <w:p>
+      <w:pPr>
+        <w:rPr>
+          <w:lang w:val="en-US"/>
+        </w:rPr>
+      </w:pPr>
+      <w:r>
+        <w:rPr>
+          <w:lang w:val="en-US"/>
+        </w:rPr>
+        <w:t>Domicile:</w:t>
+      </w:r>
+    </w:p>
+    <w:p>
+      <w:pPr>
+        <w:rPr>
+          <w:lang w:val="en-US"/>
+        </w:rPr>
+      </w:pPr>
+      <w:r>
+        <w:rPr>
+          <w:lang w:val="en-US"/>
+        </w:rPr>
+        <w:t>Clothing:</w:t>
+      </w:r>
+    </w:p>
+    <w:p>
+      <w:pPr>
+        <w:rPr>
+          <w:lang w:val="en-US"/>
+        </w:rPr>
+      </w:pPr>
+      <w:r>
+        <w:rPr>
+          <w:lang w:val="en-US"/>
+        </w:rPr>
+        <w:t>Affiliation:</w:t>
+      </w:r>
+    </w:p>
+    <w:p>
+      <w:pPr>
+        <w:rPr>
+          <w:lang w:val="en-US"/>
+        </w:rPr>
+      </w:pPr>
+      <w:r>
+        <w:rPr>
+          <w:lang w:val="en-US"/>
+        </w:rPr>
+        <w:t>Abilities:</w:t>
+      </w:r>
+    </w:p>
+    <w:p>
+      <w:pPr>
+        <w:rPr>
+          <w:lang w:val="en-US"/>
+        </w:rPr>
+      </w:pPr>
+      <w:r>
+        <w:rPr>
+          <w:lang w:val="en-US"/>
+        </w:rPr>
+        <w:t>Personality:</w:t>
+      </w:r>
+    </w:p>
+    <w:p>
+      <w:pPr>
+        <w:rPr>
+          <w:lang w:val="en-US"/>
+        </w:rPr>
+      </w:pPr>
+      <w:r>
+        <w:rPr>
+          <w:lang w:val="en-US"/>
+        </w:rPr>
+        <w:br/>
+        <w:t>Synopsis:</w:t>
+      </w:r>
+    </w:p>
+    <w:p>
+      <w:pPr>
+        <w:rPr>
+          <w:lang w:val="en-US"/>
+        </w:rPr>
+      </w:pPr>
     </w:p>
     <w:p>
       <w:pPr>
@@ -949,14 +1315,12 @@
           </mc:Fallback>
         </mc:AlternateContent>
       </w:r>
-      <w:proofErr w:type="spellStart"/>
       <w:r>
         <w:rPr>
           <w:lang w:val="en-US"/>
         </w:rPr>
         <w:t>Darior</w:t>
       </w:r>
-      <w:proofErr w:type="spellEnd"/>
     </w:p>
     <w:p>
       <w:pPr>
@@ -983,19 +1347,11 @@
           <w:lang w:val="en-US"/>
         </w:rPr>
       </w:pPr>
-      <w:proofErr w:type="spellStart"/>
-      <w:r>
-        <w:rPr>
-          <w:lang w:val="en-US"/>
-        </w:rPr>
-        <w:t>Bodyform</w:t>
-      </w:r>
-      <w:proofErr w:type="spellEnd"/>
-      <w:r>
-        <w:rPr>
-          <w:lang w:val="en-US"/>
-        </w:rPr>
-        <w:t>:</w:t>
+      <w:r>
+        <w:rPr>
+          <w:lang w:val="en-US"/>
+        </w:rPr>
+        <w:t>Bodyform:</w:t>
       </w:r>
       <w:r>
         <w:rPr>
@@ -1003,6 +1359,12 @@
         </w:rPr>
         <w:t xml:space="preserve"> strong, athletic, bald</w:t>
       </w:r>
+      <w:r>
+        <w:rPr>
+          <w:lang w:val="en-US"/>
+        </w:rPr>
+        <w:t>, scar lip</w:t>
+      </w:r>
     </w:p>
     <w:p>
       <w:pPr>
@@ -1078,16 +1440,8 @@
         <w:rPr>
           <w:lang w:val="en-US"/>
         </w:rPr>
-        <w:t xml:space="preserve"> </w:t>
-      </w:r>
-      <w:proofErr w:type="spellStart"/>
-      <w:r>
-        <w:rPr>
-          <w:lang w:val="en-US"/>
-        </w:rPr>
-        <w:t>Swordslinger</w:t>
-      </w:r>
-      <w:proofErr w:type="spellEnd"/>
+        <w:t xml:space="preserve"> Swordslinger</w:t>
+      </w:r>
     </w:p>
     <w:p>
       <w:pPr>
@@ -1207,14 +1561,12 @@
           </mc:Fallback>
         </mc:AlternateContent>
       </w:r>
-      <w:proofErr w:type="spellStart"/>
       <w:r>
         <w:rPr>
           <w:lang w:val="en-US"/>
         </w:rPr>
         <w:t>Clevar</w:t>
       </w:r>
-      <w:proofErr w:type="spellEnd"/>
     </w:p>
     <w:p>
       <w:pPr>
@@ -1241,19 +1593,11 @@
           <w:lang w:val="en-US"/>
         </w:rPr>
       </w:pPr>
-      <w:proofErr w:type="spellStart"/>
-      <w:r>
-        <w:rPr>
-          <w:lang w:val="en-US"/>
-        </w:rPr>
-        <w:t>Bodyform</w:t>
-      </w:r>
-      <w:proofErr w:type="spellEnd"/>
-      <w:r>
-        <w:rPr>
-          <w:lang w:val="en-US"/>
-        </w:rPr>
-        <w:t>:</w:t>
+      <w:r>
+        <w:rPr>
+          <w:lang w:val="en-US"/>
+        </w:rPr>
+        <w:t>Bodyform:</w:t>
       </w:r>
       <w:r>
         <w:rPr>
@@ -1336,16 +1680,8 @@
         <w:rPr>
           <w:lang w:val="en-US"/>
         </w:rPr>
-        <w:t xml:space="preserve"> </w:t>
-      </w:r>
-      <w:proofErr w:type="spellStart"/>
-      <w:r>
-        <w:rPr>
-          <w:lang w:val="en-US"/>
-        </w:rPr>
-        <w:t>Swordslinger</w:t>
-      </w:r>
-      <w:proofErr w:type="spellEnd"/>
+        <w:t xml:space="preserve"> Swordslinger</w:t>
+      </w:r>
     </w:p>
     <w:p>
       <w:pPr>
@@ -1505,14 +1841,14 @@
         </w:rPr>
         <w:t xml:space="preserve"> </w:t>
       </w:r>
-      <w:proofErr w:type="spellStart"/>
+      <w:bookmarkStart w:id="0" w:name="_Hlk226105738"/>
       <w:r>
         <w:rPr>
           <w:lang w:val="en-US"/>
         </w:rPr>
         <w:t>Bureaucratess</w:t>
       </w:r>
-      <w:proofErr w:type="spellEnd"/>
+      <w:bookmarkEnd w:id="0"/>
       <w:r>
         <w:rPr>
           <w:lang w:val="en-US"/>
@@ -1545,19 +1881,11 @@
           <w:lang w:val="en-US"/>
         </w:rPr>
       </w:pPr>
-      <w:proofErr w:type="spellStart"/>
-      <w:r>
-        <w:rPr>
-          <w:lang w:val="en-US"/>
-        </w:rPr>
-        <w:t>Bodyform</w:t>
-      </w:r>
-      <w:proofErr w:type="spellEnd"/>
-      <w:r>
-        <w:rPr>
-          <w:lang w:val="en-US"/>
-        </w:rPr>
-        <w:t>:</w:t>
+      <w:r>
+        <w:rPr>
+          <w:lang w:val="en-US"/>
+        </w:rPr>
+        <w:t>Bodyform:</w:t>
       </w:r>
       <w:r>
         <w:rPr>
@@ -1628,6 +1956,24 @@
           <w:lang w:val="en-US"/>
         </w:rPr>
         <w:t>Affiliation:</w:t>
+      </w:r>
+      <w:r>
+        <w:rPr>
+          <w:lang w:val="en-US"/>
+        </w:rPr>
+        <w:t xml:space="preserve"> </w:t>
+      </w:r>
+      <w:r>
+        <w:rPr>
+          <w:lang w:val="en-US"/>
+        </w:rPr>
+        <w:t>Bureaucra</w:t>
+      </w:r>
+      <w:r>
+        <w:rPr>
+          <w:lang w:val="en-US"/>
+        </w:rPr>
+        <w:t>dom</w:t>
       </w:r>
     </w:p>
     <w:p>
@@ -1674,6 +2020,12 @@
           <w:lang w:val="en-US"/>
         </w:rPr>
         <w:t xml:space="preserve"> Died during a bandit attack on her way to Asarat’s Peak</w:t>
+      </w:r>
+      <w:r>
+        <w:rPr>
+          <w:lang w:val="en-US"/>
+        </w:rPr>
+        <w:t>. Niece to the Consul.</w:t>
       </w:r>
     </w:p>
     <w:p>
@@ -1805,19 +2157,11 @@
           <w:lang w:val="en-US"/>
         </w:rPr>
       </w:pPr>
-      <w:proofErr w:type="spellStart"/>
-      <w:r>
-        <w:rPr>
-          <w:lang w:val="en-US"/>
-        </w:rPr>
-        <w:t>Bodyform</w:t>
-      </w:r>
-      <w:proofErr w:type="spellEnd"/>
-      <w:r>
-        <w:rPr>
-          <w:lang w:val="en-US"/>
-        </w:rPr>
-        <w:t>:</w:t>
+      <w:r>
+        <w:rPr>
+          <w:lang w:val="en-US"/>
+        </w:rPr>
+        <w:t>Bodyform:</w:t>
       </w:r>
       <w:r>
         <w:rPr>
@@ -1945,17 +2289,541 @@
     </w:p>
     <w:p>
       <w:pPr>
-        <w:rPr>
-          <w:lang w:val="en-US"/>
-        </w:rPr>
-      </w:pPr>
-    </w:p>
-    <w:p>
-      <w:pPr>
-        <w:rPr>
-          <w:lang w:val="en-US"/>
-        </w:rPr>
-      </w:pPr>
+        <w:pStyle w:val="berschrift1"/>
+        <w:rPr>
+          <w:lang w:val="en-US"/>
+        </w:rPr>
+      </w:pPr>
+      <w:r>
+        <w:rPr>
+          <w:lang w:val="en-US"/>
+        </w:rPr>
+        <w:t>Citizens of Asarat’s Peak</w:t>
+      </w:r>
+    </w:p>
+    <w:p>
+      <w:pPr>
+        <w:pStyle w:val="berschrift2"/>
+        <w:ind w:left="708" w:hanging="708"/>
+        <w:rPr>
+          <w:lang w:val="en-US"/>
+        </w:rPr>
+      </w:pPr>
+      <w:r>
+        <w:rPr>
+          <w:noProof/>
+        </w:rPr>
+        <mc:AlternateContent>
+          <mc:Choice Requires="wps">
+            <w:drawing>
+              <wp:anchor distT="0" distB="0" distL="114300" distR="114300" simplePos="0" relativeHeight="251692032" behindDoc="0" locked="0" layoutInCell="1" allowOverlap="1" wp14:anchorId="6E566FF0" wp14:editId="05114D2B">
+                <wp:simplePos x="0" y="0"/>
+                <wp:positionH relativeFrom="column">
+                  <wp:posOffset>0</wp:posOffset>
+                </wp:positionH>
+                <wp:positionV relativeFrom="paragraph">
+                  <wp:posOffset>386715</wp:posOffset>
+                </wp:positionV>
+                <wp:extent cx="2063750" cy="2679700"/>
+                <wp:effectExtent l="0" t="0" r="12700" b="25400"/>
+                <wp:wrapSquare wrapText="bothSides"/>
+                <wp:docPr id="1064175401" name="Rechteck 2"/>
+                <wp:cNvGraphicFramePr/>
+                <a:graphic xmlns:a="http://schemas.openxmlformats.org/drawingml/2006/main">
+                  <a:graphicData uri="http://schemas.microsoft.com/office/word/2010/wordprocessingShape">
+                    <wps:wsp>
+                      <wps:cNvSpPr/>
+                      <wps:spPr>
+                        <a:xfrm>
+                          <a:off x="0" y="0"/>
+                          <a:ext cx="2063750" cy="2679700"/>
+                        </a:xfrm>
+                        <a:prstGeom prst="rect">
+                          <a:avLst/>
+                        </a:prstGeom>
+                      </wps:spPr>
+                      <wps:style>
+                        <a:lnRef idx="2">
+                          <a:schemeClr val="accent1">
+                            <a:shade val="15000"/>
+                          </a:schemeClr>
+                        </a:lnRef>
+                        <a:fillRef idx="1">
+                          <a:schemeClr val="accent1"/>
+                        </a:fillRef>
+                        <a:effectRef idx="0">
+                          <a:schemeClr val="accent1"/>
+                        </a:effectRef>
+                        <a:fontRef idx="minor">
+                          <a:schemeClr val="lt1"/>
+                        </a:fontRef>
+                      </wps:style>
+                      <wps:bodyPr rot="0" spcFirstLastPara="0" vertOverflow="overflow" horzOverflow="overflow" vert="horz" wrap="square" lIns="91440" tIns="45720" rIns="91440" bIns="45720" numCol="1" spcCol="0" rtlCol="0" fromWordArt="0" anchor="ctr" anchorCtr="0" forceAA="0" compatLnSpc="1">
+                        <a:prstTxWarp prst="textNoShape">
+                          <a:avLst/>
+                        </a:prstTxWarp>
+                        <a:noAutofit/>
+                      </wps:bodyPr>
+                    </wps:wsp>
+                  </a:graphicData>
+                </a:graphic>
+                <wp14:sizeRelH relativeFrom="margin">
+                  <wp14:pctWidth>0</wp14:pctWidth>
+                </wp14:sizeRelH>
+                <wp14:sizeRelV relativeFrom="margin">
+                  <wp14:pctHeight>0</wp14:pctHeight>
+                </wp14:sizeRelV>
+              </wp:anchor>
+            </w:drawing>
+          </mc:Choice>
+          <mc:Fallback>
+            <w:pict>
+              <v:rect w14:anchorId="066C261D" id="Rechteck 2" o:spid="_x0000_s1026" style="position:absolute;margin-left:0;margin-top:30.45pt;width:162.5pt;height:211pt;z-index:251692032;visibility:visible;mso-wrap-style:square;mso-width-percent:0;mso-height-percent:0;mso-wrap-distance-left:9pt;mso-wrap-distance-top:0;mso-wrap-distance-right:9pt;mso-wrap-distance-bottom:0;mso-position-horizontal:absolute;mso-position-horizontal-relative:text;mso-position-vertical:absolute;mso-position-vertical-relative:text;mso-width-percent:0;mso-height-percent:0;mso-width-relative:margin;mso-height-relative:margin;v-text-anchor:middle" o:gfxdata="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" fillcolor="#4472c4 [3204]" strokecolor="#09101d [484]" strokeweight="1pt">
+                <w10:wrap type="square"/>
+              </v:rect>
+            </w:pict>
+          </mc:Fallback>
+        </mc:AlternateContent>
+      </w:r>
+      <w:r>
+        <w:rPr>
+          <w:lang w:val="en-US"/>
+        </w:rPr>
+        <w:t>Ubir</w:t>
+      </w:r>
+    </w:p>
+    <w:p>
+      <w:pPr>
+        <w:rPr>
+          <w:lang w:val="en-US"/>
+        </w:rPr>
+      </w:pPr>
+      <w:r>
+        <w:rPr>
+          <w:lang w:val="en-US"/>
+        </w:rPr>
+        <w:t>Age/Birthday:</w:t>
+      </w:r>
+      <w:r>
+        <w:rPr>
+          <w:lang w:val="en-US"/>
+        </w:rPr>
+        <w:t xml:space="preserve"> 40</w:t>
+      </w:r>
+    </w:p>
+    <w:p>
+      <w:pPr>
+        <w:rPr>
+          <w:lang w:val="en-US"/>
+        </w:rPr>
+      </w:pPr>
+      <w:r>
+        <w:rPr>
+          <w:lang w:val="en-US"/>
+        </w:rPr>
+        <w:t>Bodyform:</w:t>
+      </w:r>
+      <w:r>
+        <w:rPr>
+          <w:lang w:val="en-US"/>
+        </w:rPr>
+        <w:t xml:space="preserve"> long black hear, grey beard, tall, thin</w:t>
+      </w:r>
+    </w:p>
+    <w:p>
+      <w:pPr>
+        <w:rPr>
+          <w:lang w:val="en-US"/>
+        </w:rPr>
+      </w:pPr>
+      <w:r>
+        <w:rPr>
+          <w:lang w:val="en-US"/>
+        </w:rPr>
+        <w:t>Heritage:</w:t>
+      </w:r>
+      <w:r>
+        <w:rPr>
+          <w:lang w:val="en-US"/>
+        </w:rPr>
+        <w:t xml:space="preserve"> Mialkiir</w:t>
+      </w:r>
+    </w:p>
+    <w:p>
+      <w:pPr>
+        <w:rPr>
+          <w:lang w:val="en-US"/>
+        </w:rPr>
+      </w:pPr>
+      <w:r>
+        <w:rPr>
+          <w:lang w:val="en-US"/>
+        </w:rPr>
+        <w:t>Domicile:</w:t>
+      </w:r>
+      <w:r>
+        <w:rPr>
+          <w:lang w:val="en-US"/>
+        </w:rPr>
+        <w:t xml:space="preserve"> Asarat’s Peak</w:t>
+      </w:r>
+    </w:p>
+    <w:p>
+      <w:pPr>
+        <w:rPr>
+          <w:lang w:val="en-US"/>
+        </w:rPr>
+      </w:pPr>
+      <w:r>
+        <w:rPr>
+          <w:lang w:val="en-US"/>
+        </w:rPr>
+        <w:t>Clothing:</w:t>
+      </w:r>
+      <w:r>
+        <w:rPr>
+          <w:lang w:val="en-US"/>
+        </w:rPr>
+        <w:t xml:space="preserve"> brownish clothes with a </w:t>
+      </w:r>
+    </w:p>
+    <w:p>
+      <w:pPr>
+        <w:rPr>
+          <w:lang w:val="en-US"/>
+        </w:rPr>
+      </w:pPr>
+      <w:r>
+        <w:rPr>
+          <w:lang w:val="en-US"/>
+        </w:rPr>
+        <w:t>Affiliation:</w:t>
+      </w:r>
+    </w:p>
+    <w:p>
+      <w:pPr>
+        <w:rPr>
+          <w:lang w:val="en-US"/>
+        </w:rPr>
+      </w:pPr>
+      <w:r>
+        <w:rPr>
+          <w:lang w:val="en-US"/>
+        </w:rPr>
+        <w:t>Abilities:</w:t>
+      </w:r>
+    </w:p>
+    <w:p>
+      <w:pPr>
+        <w:rPr>
+          <w:lang w:val="en-US"/>
+        </w:rPr>
+      </w:pPr>
+      <w:r>
+        <w:rPr>
+          <w:lang w:val="en-US"/>
+        </w:rPr>
+        <w:t>Personality: first friendly, then flippish and angry, then humble</w:t>
+      </w:r>
+    </w:p>
+    <w:p>
+      <w:pPr>
+        <w:rPr>
+          <w:lang w:val="en-US"/>
+        </w:rPr>
+      </w:pPr>
+      <w:r>
+        <w:rPr>
+          <w:lang w:val="en-US"/>
+        </w:rPr>
+        <w:br/>
+        <w:t>Synopsis:</w:t>
+      </w:r>
+    </w:p>
+    <w:p>
+      <w:pPr>
+        <w:pStyle w:val="berschrift2"/>
+        <w:ind w:left="708" w:hanging="708"/>
+        <w:rPr>
+          <w:lang w:val="en-US"/>
+        </w:rPr>
+      </w:pPr>
+      <w:r>
+        <w:rPr>
+          <w:noProof/>
+        </w:rPr>
+        <w:lastRenderedPageBreak/>
+        <mc:AlternateContent>
+          <mc:Choice Requires="wps">
+            <w:drawing>
+              <wp:anchor distT="0" distB="0" distL="114300" distR="114300" simplePos="0" relativeHeight="251694080" behindDoc="0" locked="0" layoutInCell="1" allowOverlap="1" wp14:anchorId="200FC5CD" wp14:editId="18240DCF">
+                <wp:simplePos x="0" y="0"/>
+                <wp:positionH relativeFrom="column">
+                  <wp:posOffset>0</wp:posOffset>
+                </wp:positionH>
+                <wp:positionV relativeFrom="paragraph">
+                  <wp:posOffset>386715</wp:posOffset>
+                </wp:positionV>
+                <wp:extent cx="2063750" cy="2679700"/>
+                <wp:effectExtent l="0" t="0" r="12700" b="25400"/>
+                <wp:wrapSquare wrapText="bothSides"/>
+                <wp:docPr id="2071088021" name="Rechteck 2"/>
+                <wp:cNvGraphicFramePr/>
+                <a:graphic xmlns:a="http://schemas.openxmlformats.org/drawingml/2006/main">
+                  <a:graphicData uri="http://schemas.microsoft.com/office/word/2010/wordprocessingShape">
+                    <wps:wsp>
+                      <wps:cNvSpPr/>
+                      <wps:spPr>
+                        <a:xfrm>
+                          <a:off x="0" y="0"/>
+                          <a:ext cx="2063750" cy="2679700"/>
+                        </a:xfrm>
+                        <a:prstGeom prst="rect">
+                          <a:avLst/>
+                        </a:prstGeom>
+                      </wps:spPr>
+                      <wps:style>
+                        <a:lnRef idx="2">
+                          <a:schemeClr val="accent1">
+                            <a:shade val="15000"/>
+                          </a:schemeClr>
+                        </a:lnRef>
+                        <a:fillRef idx="1">
+                          <a:schemeClr val="accent1"/>
+                        </a:fillRef>
+                        <a:effectRef idx="0">
+                          <a:schemeClr val="accent1"/>
+                        </a:effectRef>
+                        <a:fontRef idx="minor">
+                          <a:schemeClr val="lt1"/>
+                        </a:fontRef>
+                      </wps:style>
+                      <wps:bodyPr rot="0" spcFirstLastPara="0" vertOverflow="overflow" horzOverflow="overflow" vert="horz" wrap="square" lIns="91440" tIns="45720" rIns="91440" bIns="45720" numCol="1" spcCol="0" rtlCol="0" fromWordArt="0" anchor="ctr" anchorCtr="0" forceAA="0" compatLnSpc="1">
+                        <a:prstTxWarp prst="textNoShape">
+                          <a:avLst/>
+                        </a:prstTxWarp>
+                        <a:noAutofit/>
+                      </wps:bodyPr>
+                    </wps:wsp>
+                  </a:graphicData>
+                </a:graphic>
+                <wp14:sizeRelH relativeFrom="margin">
+                  <wp14:pctWidth>0</wp14:pctWidth>
+                </wp14:sizeRelH>
+                <wp14:sizeRelV relativeFrom="margin">
+                  <wp14:pctHeight>0</wp14:pctHeight>
+                </wp14:sizeRelV>
+              </wp:anchor>
+            </w:drawing>
+          </mc:Choice>
+          <mc:Fallback>
+            <w:pict>
+              <v:rect w14:anchorId="29790F08" id="Rechteck 2" o:spid="_x0000_s1026" style="position:absolute;margin-left:0;margin-top:30.45pt;width:162.5pt;height:211pt;z-index:251694080;visibility:visible;mso-wrap-style:square;mso-width-percent:0;mso-height-percent:0;mso-wrap-distance-left:9pt;mso-wrap-distance-top:0;mso-wrap-distance-right:9pt;mso-wrap-distance-bottom:0;mso-position-horizontal:absolute;mso-position-horizontal-relative:text;mso-position-vertical:absolute;mso-position-vertical-relative:text;mso-width-percent:0;mso-height-percent:0;mso-width-relative:margin;mso-height-relative:margin;v-text-anchor:middle" o:gfxdata="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" fillcolor="#4472c4 [3204]" strokecolor="#09101d [484]" strokeweight="1pt">
+                <w10:wrap type="square"/>
+              </v:rect>
+            </w:pict>
+          </mc:Fallback>
+        </mc:AlternateContent>
+      </w:r>
+      <w:r>
+        <w:rPr>
+          <w:lang w:val="en-US"/>
+        </w:rPr>
+        <w:t>Merial</w:t>
+      </w:r>
+    </w:p>
+    <w:p>
+      <w:pPr>
+        <w:rPr>
+          <w:lang w:val="en-US"/>
+        </w:rPr>
+      </w:pPr>
+      <w:r>
+        <w:rPr>
+          <w:lang w:val="en-US"/>
+        </w:rPr>
+        <w:t>Age/Birthday:</w:t>
+      </w:r>
+      <w:r>
+        <w:rPr>
+          <w:lang w:val="en-US"/>
+        </w:rPr>
+        <w:t xml:space="preserve"> 35</w:t>
+      </w:r>
+    </w:p>
+    <w:p>
+      <w:pPr>
+        <w:rPr>
+          <w:lang w:val="en-US"/>
+        </w:rPr>
+      </w:pPr>
+      <w:r>
+        <w:rPr>
+          <w:lang w:val="en-US"/>
+        </w:rPr>
+        <w:t>Bodyform:</w:t>
+      </w:r>
+      <w:r>
+        <w:rPr>
+          <w:lang w:val="en-US"/>
+        </w:rPr>
+        <w:t xml:space="preserve"> blonde, green eyes, tall, broad</w:t>
+      </w:r>
+    </w:p>
+    <w:p>
+      <w:pPr>
+        <w:rPr>
+          <w:lang w:val="en-US"/>
+        </w:rPr>
+      </w:pPr>
+      <w:r>
+        <w:rPr>
+          <w:lang w:val="en-US"/>
+        </w:rPr>
+        <w:t>Heritage:</w:t>
+      </w:r>
+      <w:r>
+        <w:rPr>
+          <w:lang w:val="en-US"/>
+        </w:rPr>
+        <w:t xml:space="preserve"> Al</w:t>
+      </w:r>
+    </w:p>
+    <w:p>
+      <w:pPr>
+        <w:rPr>
+          <w:lang w:val="en-US"/>
+        </w:rPr>
+      </w:pPr>
+      <w:r>
+        <w:rPr>
+          <w:lang w:val="en-US"/>
+        </w:rPr>
+        <w:t>Domicile:</w:t>
+      </w:r>
+      <w:r>
+        <w:rPr>
+          <w:lang w:val="en-US"/>
+        </w:rPr>
+        <w:t xml:space="preserve"> Asarat’s Peak</w:t>
+      </w:r>
+    </w:p>
+    <w:p>
+      <w:pPr>
+        <w:rPr>
+          <w:lang w:val="en-US"/>
+        </w:rPr>
+      </w:pPr>
+      <w:r>
+        <w:rPr>
+          <w:lang w:val="en-US"/>
+        </w:rPr>
+        <w:t>Clothing:</w:t>
+      </w:r>
+      <w:r>
+        <w:rPr>
+          <w:lang w:val="en-US"/>
+        </w:rPr>
+        <w:t xml:space="preserve"> Special Guard uniform, blue with gold trim, tight fit</w:t>
+      </w:r>
+    </w:p>
+    <w:p>
+      <w:pPr>
+        <w:rPr>
+          <w:lang w:val="en-US"/>
+        </w:rPr>
+      </w:pPr>
+      <w:r>
+        <w:rPr>
+          <w:lang w:val="en-US"/>
+        </w:rPr>
+        <w:t>Affiliation:</w:t>
+      </w:r>
+      <w:r>
+        <w:rPr>
+          <w:lang w:val="en-US"/>
+        </w:rPr>
+        <w:t xml:space="preserve"> </w:t>
+      </w:r>
+      <w:r>
+        <w:rPr>
+          <w:lang w:val="en-US"/>
+        </w:rPr>
+        <w:t>Bureaurocradom</w:t>
+      </w:r>
+    </w:p>
+    <w:p>
+      <w:pPr>
+        <w:rPr>
+          <w:lang w:val="en-US"/>
+        </w:rPr>
+      </w:pPr>
+      <w:r>
+        <w:rPr>
+          <w:lang w:val="en-US"/>
+        </w:rPr>
+        <w:t>Abilities:</w:t>
+      </w:r>
+      <w:r>
+        <w:rPr>
+          <w:lang w:val="en-US"/>
+        </w:rPr>
+        <w:t xml:space="preserve"> Aikstice</w:t>
+      </w:r>
+    </w:p>
+    <w:p>
+      <w:pPr>
+        <w:rPr>
+          <w:lang w:val="en-US"/>
+        </w:rPr>
+      </w:pPr>
+      <w:r>
+        <w:rPr>
+          <w:lang w:val="en-US"/>
+        </w:rPr>
+        <w:t>Personality: brutal to friendly in a heartbeat</w:t>
+      </w:r>
+    </w:p>
+    <w:p>
+      <w:pPr>
+        <w:rPr>
+          <w:lang w:val="en-US"/>
+        </w:rPr>
+      </w:pPr>
+      <w:r>
+        <w:rPr>
+          <w:lang w:val="en-US"/>
+        </w:rPr>
+        <w:br/>
+        <w:t>Synopsis:</w:t>
+      </w:r>
+      <w:r>
+        <w:rPr>
+          <w:lang w:val="en-US"/>
+        </w:rPr>
+        <w:t xml:space="preserve"> Special Harmonist Guard (Sha) of Asarat’s Peak, captured the thief</w:t>
+      </w:r>
+    </w:p>
+    <w:p>
+      <w:pPr>
+        <w:rPr>
+          <w:lang w:val="en-US"/>
+        </w:rPr>
+      </w:pPr>
+    </w:p>
+    <w:p>
+      <w:pPr>
+        <w:pStyle w:val="berschrift1"/>
+        <w:rPr>
+          <w:lang w:val="en-US"/>
+        </w:rPr>
+      </w:pPr>
+      <w:r>
+        <w:rPr>
+          <w:lang w:val="en-US"/>
+        </w:rPr>
+        <w:t>Jor’s Group</w:t>
+      </w:r>
     </w:p>
     <w:p>
       <w:pPr>
@@ -2057,19 +2925,7 @@
         <w:rPr>
           <w:lang w:val="en-US"/>
         </w:rPr>
-        <w:t>Jor Mar-</w:t>
-      </w:r>
-      <w:r>
-        <w:rPr>
-          <w:lang w:val="en-US"/>
-        </w:rPr>
-        <w:t>L</w:t>
-      </w:r>
-      <w:r>
-        <w:rPr>
-          <w:lang w:val="en-US"/>
-        </w:rPr>
-        <w:t>or</w:t>
+        <w:t>Jor Mar-Lor</w:t>
       </w:r>
     </w:p>
     <w:p>
@@ -2091,19 +2947,11 @@
           <w:lang w:val="en-US"/>
         </w:rPr>
       </w:pPr>
-      <w:proofErr w:type="spellStart"/>
-      <w:r>
-        <w:rPr>
-          <w:lang w:val="en-US"/>
-        </w:rPr>
-        <w:t>Bodyform</w:t>
-      </w:r>
-      <w:proofErr w:type="spellEnd"/>
-      <w:r>
-        <w:rPr>
-          <w:lang w:val="en-US"/>
-        </w:rPr>
-        <w:t>:</w:t>
+      <w:r>
+        <w:rPr>
+          <w:lang w:val="en-US"/>
+        </w:rPr>
+        <w:t>Bodyform:</w:t>
       </w:r>
     </w:p>
     <w:p>
@@ -2299,7 +3147,13 @@
         <w:rPr>
           <w:lang w:val="en-US"/>
         </w:rPr>
-        <w:t>Jevan Dra-Gen</w:t>
+        <w:t>Jevan Dra-</w:t>
+      </w:r>
+      <w:r>
+        <w:rPr>
+          <w:lang w:val="en-US"/>
+        </w:rPr>
+        <w:t>N</w:t>
       </w:r>
     </w:p>
     <w:p>
@@ -2321,19 +3175,11 @@
           <w:lang w:val="en-US"/>
         </w:rPr>
       </w:pPr>
-      <w:proofErr w:type="spellStart"/>
-      <w:r>
-        <w:rPr>
-          <w:lang w:val="en-US"/>
-        </w:rPr>
-        <w:t>Bodyform</w:t>
-      </w:r>
-      <w:proofErr w:type="spellEnd"/>
-      <w:r>
-        <w:rPr>
-          <w:lang w:val="en-US"/>
-        </w:rPr>
-        <w:t>:</w:t>
+      <w:r>
+        <w:rPr>
+          <w:lang w:val="en-US"/>
+        </w:rPr>
+        <w:t>Bodyform:</w:t>
       </w:r>
     </w:p>
     <w:p>
@@ -2524,14 +3370,12 @@
         </w:rPr>
         <w:t xml:space="preserve"> </w:t>
       </w:r>
-      <w:proofErr w:type="spellStart"/>
       <w:r>
         <w:rPr>
           <w:lang w:val="en-US"/>
         </w:rPr>
         <w:t>Dormir</w:t>
       </w:r>
-      <w:proofErr w:type="spellEnd"/>
     </w:p>
     <w:p>
       <w:pPr>
@@ -2552,19 +3396,11 @@
           <w:lang w:val="en-US"/>
         </w:rPr>
       </w:pPr>
-      <w:proofErr w:type="spellStart"/>
-      <w:r>
-        <w:rPr>
-          <w:lang w:val="en-US"/>
-        </w:rPr>
-        <w:t>Bodyform</w:t>
-      </w:r>
-      <w:proofErr w:type="spellEnd"/>
-      <w:r>
-        <w:rPr>
-          <w:lang w:val="en-US"/>
-        </w:rPr>
-        <w:t>:</w:t>
+      <w:r>
+        <w:rPr>
+          <w:lang w:val="en-US"/>
+        </w:rPr>
+        <w:t>Bodyform:</w:t>
       </w:r>
     </w:p>
     <w:p>
@@ -2756,14 +3592,12 @@
         </w:rPr>
         <w:t xml:space="preserve"> </w:t>
       </w:r>
-      <w:proofErr w:type="spellStart"/>
       <w:r>
         <w:rPr>
           <w:lang w:val="en-US"/>
         </w:rPr>
         <w:t>Lanilor</w:t>
       </w:r>
-      <w:proofErr w:type="spellEnd"/>
     </w:p>
     <w:p>
       <w:pPr>
@@ -2784,19 +3618,11 @@
           <w:lang w:val="en-US"/>
         </w:rPr>
       </w:pPr>
-      <w:proofErr w:type="spellStart"/>
-      <w:r>
-        <w:rPr>
-          <w:lang w:val="en-US"/>
-        </w:rPr>
-        <w:t>Bodyform</w:t>
-      </w:r>
-      <w:proofErr w:type="spellEnd"/>
-      <w:r>
-        <w:rPr>
-          <w:lang w:val="en-US"/>
-        </w:rPr>
-        <w:t>:</w:t>
+      <w:r>
+        <w:rPr>
+          <w:lang w:val="en-US"/>
+        </w:rPr>
+        <w:t>Bodyform:</w:t>
       </w:r>
     </w:p>
     <w:p>
@@ -3013,19 +3839,11 @@
           <w:lang w:val="en-US"/>
         </w:rPr>
       </w:pPr>
-      <w:proofErr w:type="spellStart"/>
-      <w:r>
-        <w:rPr>
-          <w:lang w:val="en-US"/>
-        </w:rPr>
-        <w:t>Bodyform</w:t>
-      </w:r>
-      <w:proofErr w:type="spellEnd"/>
-      <w:r>
-        <w:rPr>
-          <w:lang w:val="en-US"/>
-        </w:rPr>
-        <w:t>:</w:t>
+      <w:r>
+        <w:rPr>
+          <w:lang w:val="en-US"/>
+        </w:rPr>
+        <w:t>Bodyform:</w:t>
       </w:r>
     </w:p>
     <w:p>
@@ -3243,19 +4061,11 @@
           <w:lang w:val="en-US"/>
         </w:rPr>
       </w:pPr>
-      <w:proofErr w:type="spellStart"/>
-      <w:r>
-        <w:rPr>
-          <w:lang w:val="en-US"/>
-        </w:rPr>
-        <w:t>Bodyform</w:t>
-      </w:r>
-      <w:proofErr w:type="spellEnd"/>
-      <w:r>
-        <w:rPr>
-          <w:lang w:val="en-US"/>
-        </w:rPr>
-        <w:t>:</w:t>
+      <w:r>
+        <w:rPr>
+          <w:lang w:val="en-US"/>
+        </w:rPr>
+        <w:t>Bodyform:</w:t>
       </w:r>
     </w:p>
     <w:p>
@@ -3446,16 +4256,14 @@
         </w:rPr>
         <w:t xml:space="preserve"> </w:t>
       </w:r>
-      <w:bookmarkStart w:id="0" w:name="_Hlk224676340"/>
-      <w:proofErr w:type="spellStart"/>
+      <w:bookmarkStart w:id="1" w:name="_Hlk224676340"/>
       <w:r>
         <w:rPr>
           <w:lang w:val="en-US"/>
         </w:rPr>
         <w:t>Jazialilin</w:t>
       </w:r>
-      <w:bookmarkEnd w:id="0"/>
-      <w:proofErr w:type="spellEnd"/>
+      <w:bookmarkEnd w:id="1"/>
     </w:p>
     <w:p>
       <w:pPr>
@@ -3476,19 +4284,11 @@
           <w:lang w:val="en-US"/>
         </w:rPr>
       </w:pPr>
-      <w:proofErr w:type="spellStart"/>
-      <w:r>
-        <w:rPr>
-          <w:lang w:val="en-US"/>
-        </w:rPr>
-        <w:t>Bodyform</w:t>
-      </w:r>
-      <w:proofErr w:type="spellEnd"/>
-      <w:r>
-        <w:rPr>
-          <w:lang w:val="en-US"/>
-        </w:rPr>
-        <w:t>:</w:t>
+      <w:r>
+        <w:rPr>
+          <w:lang w:val="en-US"/>
+        </w:rPr>
+        <w:t>Bodyform:</w:t>
       </w:r>
     </w:p>
     <w:p>
@@ -3596,6 +4396,536 @@
           <w:lang w:val="en-US"/>
         </w:rPr>
       </w:pPr>
+    </w:p>
+    <w:p>
+      <w:pPr>
+        <w:pStyle w:val="berschrift2"/>
+        <w:rPr>
+          <w:lang w:val="en-US"/>
+        </w:rPr>
+      </w:pPr>
+      <w:r>
+        <w:rPr>
+          <w:lang w:val="en-US"/>
+        </w:rPr>
+        <w:lastRenderedPageBreak/>
+        <w:t>Priests of Sun and Moon</w:t>
+      </w:r>
+    </w:p>
+    <w:p>
+      <w:pPr>
+        <w:pStyle w:val="berschrift2"/>
+        <w:ind w:left="708" w:hanging="708"/>
+        <w:rPr>
+          <w:lang w:val="en-US"/>
+        </w:rPr>
+      </w:pPr>
+      <w:r>
+        <w:rPr>
+          <w:noProof/>
+        </w:rPr>
+        <mc:AlternateContent>
+          <mc:Choice Requires="wps">
+            <w:drawing>
+              <wp:anchor distT="0" distB="0" distL="114300" distR="114300" simplePos="0" relativeHeight="251696128" behindDoc="0" locked="0" layoutInCell="1" allowOverlap="1" wp14:anchorId="3A46EC44" wp14:editId="4DE2C857">
+                <wp:simplePos x="0" y="0"/>
+                <wp:positionH relativeFrom="column">
+                  <wp:posOffset>0</wp:posOffset>
+                </wp:positionH>
+                <wp:positionV relativeFrom="paragraph">
+                  <wp:posOffset>386715</wp:posOffset>
+                </wp:positionV>
+                <wp:extent cx="2063750" cy="2679700"/>
+                <wp:effectExtent l="0" t="0" r="12700" b="25400"/>
+                <wp:wrapSquare wrapText="bothSides"/>
+                <wp:docPr id="145831076" name="Rechteck 2"/>
+                <wp:cNvGraphicFramePr/>
+                <a:graphic xmlns:a="http://schemas.openxmlformats.org/drawingml/2006/main">
+                  <a:graphicData uri="http://schemas.microsoft.com/office/word/2010/wordprocessingShape">
+                    <wps:wsp>
+                      <wps:cNvSpPr/>
+                      <wps:spPr>
+                        <a:xfrm>
+                          <a:off x="0" y="0"/>
+                          <a:ext cx="2063750" cy="2679700"/>
+                        </a:xfrm>
+                        <a:prstGeom prst="rect">
+                          <a:avLst/>
+                        </a:prstGeom>
+                      </wps:spPr>
+                      <wps:style>
+                        <a:lnRef idx="2">
+                          <a:schemeClr val="accent1">
+                            <a:shade val="15000"/>
+                          </a:schemeClr>
+                        </a:lnRef>
+                        <a:fillRef idx="1">
+                          <a:schemeClr val="accent1"/>
+                        </a:fillRef>
+                        <a:effectRef idx="0">
+                          <a:schemeClr val="accent1"/>
+                        </a:effectRef>
+                        <a:fontRef idx="minor">
+                          <a:schemeClr val="lt1"/>
+                        </a:fontRef>
+                      </wps:style>
+                      <wps:bodyPr rot="0" spcFirstLastPara="0" vertOverflow="overflow" horzOverflow="overflow" vert="horz" wrap="square" lIns="91440" tIns="45720" rIns="91440" bIns="45720" numCol="1" spcCol="0" rtlCol="0" fromWordArt="0" anchor="ctr" anchorCtr="0" forceAA="0" compatLnSpc="1">
+                        <a:prstTxWarp prst="textNoShape">
+                          <a:avLst/>
+                        </a:prstTxWarp>
+                        <a:noAutofit/>
+                      </wps:bodyPr>
+                    </wps:wsp>
+                  </a:graphicData>
+                </a:graphic>
+                <wp14:sizeRelH relativeFrom="margin">
+                  <wp14:pctWidth>0</wp14:pctWidth>
+                </wp14:sizeRelH>
+                <wp14:sizeRelV relativeFrom="margin">
+                  <wp14:pctHeight>0</wp14:pctHeight>
+                </wp14:sizeRelV>
+              </wp:anchor>
+            </w:drawing>
+          </mc:Choice>
+          <mc:Fallback>
+            <w:pict>
+              <v:rect w14:anchorId="2C4D4873" id="Rechteck 2" o:spid="_x0000_s1026" style="position:absolute;margin-left:0;margin-top:30.45pt;width:162.5pt;height:211pt;z-index:251696128;visibility:visible;mso-wrap-style:square;mso-width-percent:0;mso-height-percent:0;mso-wrap-distance-left:9pt;mso-wrap-distance-top:0;mso-wrap-distance-right:9pt;mso-wrap-distance-bottom:0;mso-position-horizontal:absolute;mso-position-horizontal-relative:text;mso-position-vertical:absolute;mso-position-vertical-relative:text;mso-width-percent:0;mso-height-percent:0;mso-width-relative:margin;mso-height-relative:margin;v-text-anchor:middle" o:gfxdata="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" fillcolor="#4472c4 [3204]" strokecolor="#09101d [484]" strokeweight="1pt">
+                <w10:wrap type="square"/>
+              </v:rect>
+            </w:pict>
+          </mc:Fallback>
+        </mc:AlternateContent>
+      </w:r>
+      <w:r>
+        <w:rPr>
+          <w:lang w:val="en-US"/>
+        </w:rPr>
+        <w:t xml:space="preserve"> </w:t>
+      </w:r>
+      <w:r>
+        <w:rPr>
+          <w:lang w:val="en-US"/>
+        </w:rPr>
+        <w:t>Kavair Trelid</w:t>
+      </w:r>
+    </w:p>
+    <w:p>
+      <w:pPr>
+        <w:rPr>
+          <w:lang w:val="en-US"/>
+        </w:rPr>
+      </w:pPr>
+      <w:r>
+        <w:rPr>
+          <w:lang w:val="en-US"/>
+        </w:rPr>
+        <w:t>Age/Birthday:</w:t>
+      </w:r>
+    </w:p>
+    <w:p>
+      <w:pPr>
+        <w:rPr>
+          <w:lang w:val="en-US"/>
+        </w:rPr>
+      </w:pPr>
+      <w:r>
+        <w:rPr>
+          <w:lang w:val="en-US"/>
+        </w:rPr>
+        <w:t>Bodyform:</w:t>
+      </w:r>
+    </w:p>
+    <w:p>
+      <w:pPr>
+        <w:rPr>
+          <w:lang w:val="en-US"/>
+        </w:rPr>
+      </w:pPr>
+      <w:r>
+        <w:rPr>
+          <w:lang w:val="en-US"/>
+        </w:rPr>
+        <w:t>Heritage:</w:t>
+      </w:r>
+      <w:r>
+        <w:rPr>
+          <w:lang w:val="en-US"/>
+        </w:rPr>
+        <w:t xml:space="preserve"> Married to Siinal Trelid (holy last name)</w:t>
+      </w:r>
+    </w:p>
+    <w:p>
+      <w:pPr>
+        <w:rPr>
+          <w:lang w:val="en-US"/>
+        </w:rPr>
+      </w:pPr>
+      <w:r>
+        <w:rPr>
+          <w:lang w:val="en-US"/>
+        </w:rPr>
+        <w:t>Domicile:</w:t>
+      </w:r>
+      <w:r>
+        <w:rPr>
+          <w:lang w:val="en-US"/>
+        </w:rPr>
+        <w:t xml:space="preserve"> Temple of Sun and Moon</w:t>
+      </w:r>
+    </w:p>
+    <w:p>
+      <w:pPr>
+        <w:rPr>
+          <w:lang w:val="en-US"/>
+        </w:rPr>
+      </w:pPr>
+      <w:r>
+        <w:rPr>
+          <w:lang w:val="en-US"/>
+        </w:rPr>
+        <w:t>Clothing:</w:t>
+      </w:r>
+      <w:r>
+        <w:rPr>
+          <w:lang w:val="en-US"/>
+        </w:rPr>
+        <w:t xml:space="preserve"> Robes of Temple of Sun and Moon</w:t>
+      </w:r>
+    </w:p>
+    <w:p>
+      <w:pPr>
+        <w:rPr>
+          <w:lang w:val="en-US"/>
+        </w:rPr>
+      </w:pPr>
+      <w:r>
+        <w:rPr>
+          <w:lang w:val="en-US"/>
+        </w:rPr>
+        <w:t>Affiliation:</w:t>
+      </w:r>
+      <w:r>
+        <w:rPr>
+          <w:lang w:val="en-US"/>
+        </w:rPr>
+        <w:t xml:space="preserve"> Temple of Sun and Moon</w:t>
+      </w:r>
+    </w:p>
+    <w:p>
+      <w:pPr>
+        <w:rPr>
+          <w:lang w:val="en-US"/>
+        </w:rPr>
+      </w:pPr>
+      <w:r>
+        <w:rPr>
+          <w:lang w:val="en-US"/>
+        </w:rPr>
+        <w:t>Abilities:</w:t>
+      </w:r>
+      <w:r>
+        <w:rPr>
+          <w:lang w:val="en-US"/>
+        </w:rPr>
+        <w:t xml:space="preserve"> </w:t>
+      </w:r>
+      <w:r>
+        <w:rPr>
+          <w:lang w:val="en-US"/>
+        </w:rPr>
+        <w:t>Shistice</w:t>
+      </w:r>
+    </w:p>
+    <w:p>
+      <w:pPr>
+        <w:rPr>
+          <w:lang w:val="en-US"/>
+        </w:rPr>
+      </w:pPr>
+      <w:r>
+        <w:rPr>
+          <w:lang w:val="en-US"/>
+        </w:rPr>
+        <w:t>Personality:</w:t>
+      </w:r>
+    </w:p>
+    <w:p>
+      <w:pPr>
+        <w:rPr>
+          <w:lang w:val="en-US"/>
+        </w:rPr>
+      </w:pPr>
+      <w:r>
+        <w:rPr>
+          <w:lang w:val="en-US"/>
+        </w:rPr>
+        <w:br/>
+        <w:t>Synopsis:</w:t>
+      </w:r>
+      <w:r>
+        <w:rPr>
+          <w:lang w:val="en-US"/>
+        </w:rPr>
+        <w:t xml:space="preserve"> has had visions of Camille months before the first book, telling him to slowly degrade her and make her miserable. Didn’t know why, but kept faith in his religion and the Immortal Oracle</w:t>
+      </w:r>
+    </w:p>
+    <w:p>
+      <w:pPr>
+        <w:rPr>
+          <w:lang w:val="en-US"/>
+        </w:rPr>
+      </w:pPr>
+    </w:p>
+    <w:p>
+      <w:pPr>
+        <w:pStyle w:val="berschrift2"/>
+        <w:ind w:left="708" w:hanging="708"/>
+        <w:rPr>
+          <w:lang w:val="en-US"/>
+        </w:rPr>
+      </w:pPr>
+      <w:r>
+        <w:rPr>
+          <w:noProof/>
+        </w:rPr>
+        <mc:AlternateContent>
+          <mc:Choice Requires="wps">
+            <w:drawing>
+              <wp:anchor distT="0" distB="0" distL="114300" distR="114300" simplePos="0" relativeHeight="251698176" behindDoc="0" locked="0" layoutInCell="1" allowOverlap="1" wp14:anchorId="617CE5E6" wp14:editId="0F8C9DF8">
+                <wp:simplePos x="0" y="0"/>
+                <wp:positionH relativeFrom="column">
+                  <wp:posOffset>0</wp:posOffset>
+                </wp:positionH>
+                <wp:positionV relativeFrom="paragraph">
+                  <wp:posOffset>386715</wp:posOffset>
+                </wp:positionV>
+                <wp:extent cx="2063750" cy="2679700"/>
+                <wp:effectExtent l="0" t="0" r="12700" b="25400"/>
+                <wp:wrapSquare wrapText="bothSides"/>
+                <wp:docPr id="1304401918" name="Rechteck 2"/>
+                <wp:cNvGraphicFramePr/>
+                <a:graphic xmlns:a="http://schemas.openxmlformats.org/drawingml/2006/main">
+                  <a:graphicData uri="http://schemas.microsoft.com/office/word/2010/wordprocessingShape">
+                    <wps:wsp>
+                      <wps:cNvSpPr/>
+                      <wps:spPr>
+                        <a:xfrm>
+                          <a:off x="0" y="0"/>
+                          <a:ext cx="2063750" cy="2679700"/>
+                        </a:xfrm>
+                        <a:prstGeom prst="rect">
+                          <a:avLst/>
+                        </a:prstGeom>
+                      </wps:spPr>
+                      <wps:style>
+                        <a:lnRef idx="2">
+                          <a:schemeClr val="accent1">
+                            <a:shade val="15000"/>
+                          </a:schemeClr>
+                        </a:lnRef>
+                        <a:fillRef idx="1">
+                          <a:schemeClr val="accent1"/>
+                        </a:fillRef>
+                        <a:effectRef idx="0">
+                          <a:schemeClr val="accent1"/>
+                        </a:effectRef>
+                        <a:fontRef idx="minor">
+                          <a:schemeClr val="lt1"/>
+                        </a:fontRef>
+                      </wps:style>
+                      <wps:bodyPr rot="0" spcFirstLastPara="0" vertOverflow="overflow" horzOverflow="overflow" vert="horz" wrap="square" lIns="91440" tIns="45720" rIns="91440" bIns="45720" numCol="1" spcCol="0" rtlCol="0" fromWordArt="0" anchor="ctr" anchorCtr="0" forceAA="0" compatLnSpc="1">
+                        <a:prstTxWarp prst="textNoShape">
+                          <a:avLst/>
+                        </a:prstTxWarp>
+                        <a:noAutofit/>
+                      </wps:bodyPr>
+                    </wps:wsp>
+                  </a:graphicData>
+                </a:graphic>
+                <wp14:sizeRelH relativeFrom="margin">
+                  <wp14:pctWidth>0</wp14:pctWidth>
+                </wp14:sizeRelH>
+                <wp14:sizeRelV relativeFrom="margin">
+                  <wp14:pctHeight>0</wp14:pctHeight>
+                </wp14:sizeRelV>
+              </wp:anchor>
+            </w:drawing>
+          </mc:Choice>
+          <mc:Fallback>
+            <w:pict>
+              <v:rect w14:anchorId="43CC589D" id="Rechteck 2" o:spid="_x0000_s1026" style="position:absolute;margin-left:0;margin-top:30.45pt;width:162.5pt;height:211pt;z-index:251698176;visibility:visible;mso-wrap-style:square;mso-width-percent:0;mso-height-percent:0;mso-wrap-distance-left:9pt;mso-wrap-distance-top:0;mso-wrap-distance-right:9pt;mso-wrap-distance-bottom:0;mso-position-horizontal:absolute;mso-position-horizontal-relative:text;mso-position-vertical:absolute;mso-position-vertical-relative:text;mso-width-percent:0;mso-height-percent:0;mso-width-relative:margin;mso-height-relative:margin;v-text-anchor:middle" o:gfxdata="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" fillcolor="#4472c4 [3204]" strokecolor="#09101d [484]" strokeweight="1pt">
+                <w10:wrap type="square"/>
+              </v:rect>
+            </w:pict>
+          </mc:Fallback>
+        </mc:AlternateContent>
+      </w:r>
+      <w:r>
+        <w:rPr>
+          <w:lang w:val="en-US"/>
+        </w:rPr>
+        <w:t>Siinal Trelid</w:t>
+      </w:r>
+    </w:p>
+    <w:p>
+      <w:pPr>
+        <w:rPr>
+          <w:lang w:val="en-US"/>
+        </w:rPr>
+      </w:pPr>
+      <w:r>
+        <w:rPr>
+          <w:lang w:val="en-US"/>
+        </w:rPr>
+        <w:t>Age/Birthday:</w:t>
+      </w:r>
+    </w:p>
+    <w:p>
+      <w:pPr>
+        <w:rPr>
+          <w:lang w:val="en-US"/>
+        </w:rPr>
+      </w:pPr>
+      <w:r>
+        <w:rPr>
+          <w:lang w:val="en-US"/>
+        </w:rPr>
+        <w:t>Bodyform:</w:t>
+      </w:r>
+    </w:p>
+    <w:p>
+      <w:pPr>
+        <w:rPr>
+          <w:lang w:val="en-US"/>
+        </w:rPr>
+      </w:pPr>
+      <w:r>
+        <w:rPr>
+          <w:lang w:val="en-US"/>
+        </w:rPr>
+        <w:t>Heritage:</w:t>
+      </w:r>
+      <w:r>
+        <w:rPr>
+          <w:lang w:val="en-US"/>
+        </w:rPr>
+        <w:t xml:space="preserve"> Married to Kaviar Trelid (holy last name)</w:t>
+      </w:r>
+    </w:p>
+    <w:p>
+      <w:pPr>
+        <w:rPr>
+          <w:lang w:val="en-US"/>
+        </w:rPr>
+      </w:pPr>
+      <w:r>
+        <w:rPr>
+          <w:lang w:val="en-US"/>
+        </w:rPr>
+        <w:t>Domicile:</w:t>
+      </w:r>
+      <w:r>
+        <w:rPr>
+          <w:lang w:val="en-US"/>
+        </w:rPr>
+        <w:t xml:space="preserve"> Temple of Sun and Moon</w:t>
+      </w:r>
+    </w:p>
+    <w:p>
+      <w:pPr>
+        <w:rPr>
+          <w:lang w:val="en-US"/>
+        </w:rPr>
+      </w:pPr>
+      <w:r>
+        <w:rPr>
+          <w:lang w:val="en-US"/>
+        </w:rPr>
+        <w:t>Clothing:</w:t>
+      </w:r>
+      <w:r>
+        <w:rPr>
+          <w:lang w:val="en-US"/>
+        </w:rPr>
+        <w:t xml:space="preserve"> Robes of Temple of Sun and Moon</w:t>
+      </w:r>
+    </w:p>
+    <w:p>
+      <w:pPr>
+        <w:rPr>
+          <w:lang w:val="en-US"/>
+        </w:rPr>
+      </w:pPr>
+      <w:r>
+        <w:rPr>
+          <w:lang w:val="en-US"/>
+        </w:rPr>
+        <w:t>Affiliation:</w:t>
+      </w:r>
+      <w:r>
+        <w:rPr>
+          <w:lang w:val="en-US"/>
+        </w:rPr>
+        <w:t xml:space="preserve"> Temple of Sun and Moon</w:t>
+      </w:r>
+    </w:p>
+    <w:p>
+      <w:pPr>
+        <w:rPr>
+          <w:lang w:val="en-US"/>
+        </w:rPr>
+      </w:pPr>
+      <w:r>
+        <w:rPr>
+          <w:lang w:val="en-US"/>
+        </w:rPr>
+        <w:t>Abilities:</w:t>
+      </w:r>
+      <w:r>
+        <w:rPr>
+          <w:lang w:val="en-US"/>
+        </w:rPr>
+        <w:t xml:space="preserve"> </w:t>
+      </w:r>
+      <w:r>
+        <w:rPr>
+          <w:lang w:val="en-US"/>
+        </w:rPr>
+        <w:t>Shaikstice</w:t>
+      </w:r>
+    </w:p>
+    <w:p>
+      <w:pPr>
+        <w:rPr>
+          <w:lang w:val="en-US"/>
+        </w:rPr>
+      </w:pPr>
+      <w:r>
+        <w:rPr>
+          <w:lang w:val="en-US"/>
+        </w:rPr>
+        <w:t>Personality:</w:t>
+      </w:r>
+    </w:p>
+    <w:p>
+      <w:pPr>
+        <w:rPr>
+          <w:lang w:val="en-US"/>
+        </w:rPr>
+      </w:pPr>
+      <w:r>
+        <w:rPr>
+          <w:lang w:val="en-US"/>
+        </w:rPr>
+        <w:br/>
+        <w:t>Synopsis:</w:t>
+      </w:r>
+      <w:r>
+        <w:rPr>
+          <w:lang w:val="en-US"/>
+        </w:rPr>
+        <w:t xml:space="preserve"> Believes her husbands visions and follows him into the fight</w:t>
+      </w:r>
     </w:p>
     <w:p>
       <w:pPr>
@@ -4255,7 +5585,7 @@
   <w:style w:type="paragraph" w:default="1" w:styleId="Standard">
     <w:name w:val="Normal"/>
     <w:qFormat/>
-    <w:rsid w:val="00BD0D4F"/>
+    <w:rsid w:val="001749A0"/>
   </w:style>
   <w:style w:type="paragraph" w:styleId="berschrift1">
     <w:name w:val="heading 1"/>

</xml_diff>

<commit_message>
Camill Book follow up
</commit_message>
<xml_diff>
--- a/docs/Buch Camille Chronicles/Character-Bios.docx
+++ b/docs/Buch Camille Chronicles/Character-Bios.docx
@@ -273,7 +273,7 @@
         <w:rPr>
           <w:lang w:val="en-US"/>
         </w:rPr>
-        <w:t>Camille and family</w:t>
+        <w:t>Camill and family</w:t>
       </w:r>
     </w:p>
     <w:p>
@@ -364,7 +364,7 @@
         <w:rPr>
           <w:lang w:val="en-US"/>
         </w:rPr>
-        <w:t>Camille Bulwer</w:t>
+        <w:t>Camill Bulwer</w:t>
       </w:r>
     </w:p>
     <w:p>
@@ -547,7 +547,19 @@
         <w:rPr>
           <w:lang w:val="en-US"/>
         </w:rPr>
-        <w:t>Personality: Springy, snappy, caring, selfless arrogant</w:t>
+        <w:t>Personality: Springy, snappy, caring, selfless</w:t>
+      </w:r>
+      <w:r>
+        <w:rPr>
+          <w:lang w:val="en-US"/>
+        </w:rPr>
+        <w:t>ly</w:t>
+      </w:r>
+      <w:r>
+        <w:rPr>
+          <w:lang w:val="en-US"/>
+        </w:rPr>
+        <w:t xml:space="preserve"> arrogant</w:t>
       </w:r>
     </w:p>
     <w:p>
@@ -724,6 +736,26 @@
         </w:rPr>
         <w:t>Heritage:</w:t>
       </w:r>
+      <w:r>
+        <w:rPr>
+          <w:lang w:val="en-US"/>
+        </w:rPr>
+        <w:t xml:space="preserve"> </w:t>
+      </w:r>
+      <w:proofErr w:type="spellStart"/>
+      <w:r>
+        <w:rPr>
+          <w:lang w:val="en-US"/>
+        </w:rPr>
+        <w:t>Tresmor’s</w:t>
+      </w:r>
+      <w:proofErr w:type="spellEnd"/>
+      <w:r>
+        <w:rPr>
+          <w:lang w:val="en-US"/>
+        </w:rPr>
+        <w:t xml:space="preserve"> Venture</w:t>
+      </w:r>
     </w:p>
     <w:p>
       <w:pPr>
@@ -737,6 +769,12 @@
         </w:rPr>
         <w:t>Domicile:</w:t>
       </w:r>
+      <w:r>
+        <w:rPr>
+          <w:lang w:val="en-US"/>
+        </w:rPr>
+        <w:t xml:space="preserve"> Camill’s mind</w:t>
+      </w:r>
     </w:p>
     <w:p>
       <w:pPr>
@@ -787,6 +825,12 @@
           <w:lang w:val="en-US"/>
         </w:rPr>
         <w:t xml:space="preserve"> </w:t>
+      </w:r>
+      <w:r>
+        <w:rPr>
+          <w:lang w:val="en-US"/>
+        </w:rPr>
+        <w:t xml:space="preserve">Farming, </w:t>
       </w:r>
       <w:proofErr w:type="spellStart"/>
       <w:r>
@@ -827,7 +871,7 @@
         <w:rPr>
           <w:lang w:val="en-US"/>
         </w:rPr>
-        <w:t xml:space="preserve"> The Soul that is bound to Camille, tells that he had died of old age </w:t>
+        <w:t xml:space="preserve"> The Soul that is bound to Camill, tells that he had died of old age </w:t>
       </w:r>
       <w:r>
         <w:rPr>
@@ -839,7 +883,7 @@
         <w:rPr>
           <w:lang w:val="en-US"/>
         </w:rPr>
-        <w:t xml:space="preserve">so Camille could acquire </w:t>
+        <w:t xml:space="preserve">so Camill could acquire </w:t>
       </w:r>
       <w:proofErr w:type="spellStart"/>
       <w:r>
@@ -944,7 +988,7 @@
         <w:rPr>
           <w:lang w:val="en-US"/>
         </w:rPr>
-        <w:t>Camille Mother</w:t>
+        <w:t>Camill Mother</w:t>
       </w:r>
     </w:p>
     <w:p>
@@ -1164,19 +1208,11 @@
           </mc:Fallback>
         </mc:AlternateContent>
       </w:r>
-      <w:proofErr w:type="spellStart"/>
-      <w:r>
-        <w:rPr>
-          <w:lang w:val="en-US"/>
-        </w:rPr>
-        <w:t>Camilel</w:t>
-      </w:r>
-      <w:proofErr w:type="spellEnd"/>
-      <w:r>
-        <w:rPr>
-          <w:lang w:val="en-US"/>
-        </w:rPr>
-        <w:t xml:space="preserve"> Father</w:t>
+      <w:r>
+        <w:rPr>
+          <w:lang w:val="en-US"/>
+        </w:rPr>
+        <w:t>Camill Father</w:t>
       </w:r>
     </w:p>
     <w:p>
@@ -3420,7 +3456,7 @@
         <w:rPr>
           <w:lang w:val="en-US"/>
         </w:rPr>
-        <w:t xml:space="preserve">Trella, </w:t>
+        <w:t xml:space="preserve">Trell, </w:t>
       </w:r>
       <w:r>
         <w:rPr>
@@ -4441,13 +4477,13 @@
         <w:rPr>
           <w:lang w:val="en-US"/>
         </w:rPr>
-        <w:t>Jevan Dra-</w:t>
-      </w:r>
-      <w:r>
-        <w:rPr>
-          <w:lang w:val="en-US"/>
-        </w:rPr>
-        <w:t>N</w:t>
+        <w:t>Jevan Dra</w:t>
+      </w:r>
+      <w:r>
+        <w:rPr>
+          <w:lang w:val="en-US"/>
+        </w:rPr>
+        <w:t>g-N</w:t>
       </w:r>
     </w:p>
     <w:p>
@@ -4547,6 +4583,12 @@
           <w:lang w:val="en-US"/>
         </w:rPr>
         <w:t>Abilities:</w:t>
+      </w:r>
+      <w:r>
+        <w:rPr>
+          <w:lang w:val="en-US"/>
+        </w:rPr>
+        <w:t xml:space="preserve"> </w:t>
       </w:r>
     </w:p>
     <w:p>
@@ -4574,6 +4616,26 @@
         </w:rPr>
         <w:br/>
         <w:t>Synopsis:</w:t>
+      </w:r>
+      <w:r>
+        <w:rPr>
+          <w:lang w:val="en-US"/>
+        </w:rPr>
+        <w:t xml:space="preserve"> His Stice is Jeril Ormarill, former wife of </w:t>
+      </w:r>
+      <w:proofErr w:type="spellStart"/>
+      <w:r>
+        <w:rPr>
+          <w:lang w:val="en-US"/>
+        </w:rPr>
+        <w:t>Herriar</w:t>
+      </w:r>
+      <w:proofErr w:type="spellEnd"/>
+      <w:r>
+        <w:rPr>
+          <w:lang w:val="en-US"/>
+        </w:rPr>
+        <w:t xml:space="preserve"> that had died in a house fire</w:t>
       </w:r>
     </w:p>
     <w:p>
@@ -5519,6 +5581,12 @@
         <w:br/>
         <w:t>Synopsis:</w:t>
       </w:r>
+      <w:r>
+        <w:rPr>
+          <w:lang w:val="en-US"/>
+        </w:rPr>
+        <w:t xml:space="preserve"> Was also fighting in the arena until debt had overcome her in the days that Camillw as on the street.</w:t>
+      </w:r>
     </w:p>
     <w:p>
       <w:pPr>
@@ -5885,12 +5953,6 @@
             </w:pict>
           </mc:Fallback>
         </mc:AlternateContent>
-      </w:r>
-      <w:r>
-        <w:rPr>
-          <w:lang w:val="en-US"/>
-        </w:rPr>
-        <w:t xml:space="preserve"> </w:t>
       </w:r>
       <w:proofErr w:type="spellStart"/>
       <w:r>

</xml_diff>